<commit_message>
Publier le modele sectoriel a trois modes et les entrees actualisees
</commit_message>
<xml_diff>
--- a/docs/Guide_production_modele_sectoriel.docx
+++ b/docs/Guide_production_modele_sectoriel.docx
@@ -1639,7 +1639,7 @@
     </w:p>
     <w:p>
       <w:r>
-        <w:t>Le fichier macro fournit le cycle de chaque marché. EU combine trois composantes et filtre les changements de régime (seuils 0,05 et 0,10) ; US pondère quatre composantes à 30 % / 30 % / 30 % / 10 %.</w:t>
+        <w:t>Le fichier macro fournit les scores et cycles enregistrés dans Excel. EU : moyenne de quatre composantes (score U) et cycle filtré AB. US : quatre composantes pondérées à 30 % / 30 % / 30 % / 10 % (score Q) et cycle filtré U.</w:t>
       </w:r>
     </w:p>
     <w:p>
@@ -2986,7 +2986,7 @@
     </w:p>
     <w:p>
       <w:r>
-        <w:t>Le calcul se déroule dans Python ; Excel fournit les entrées enregistrées et présente les résultats. Les fonctions suivantes constituent le chemin mensuel réellement exécuté.</w:t>
+        <w:t>Le même calcul Python sert aux trois modes : production, reconstruction historique et replay. Le schéma suivant décrit le parcours mensuel de production.</w:t>
       </w:r>
     </w:p>
     <w:tbl>
@@ -3817,7 +3817,7 @@
     </w:p>
     <w:p>
       <w:r>
-        <w:t>SectorModel.run() construit les résultats en mémoire et peut enregistrer de nouvelles observations dans data_history.xlsx. SectorModel.run_production() produit également les fichiers de sortie. Actualiser.bat passe par actualiser_excel.py pour mettre à jour les XLSM eux-mêmes.</w:t>
+        <w:t>actualiser_excel.py utilise production par défaut : Excel complète data_history.xlsx, puis Output, Reco_histo et Dashboard sont actualisés. rebuild crée un nouvel historique à partir des Excel ; replay recalcule le modèle à partir du seul historique figé, sans ouvrir Excel. Pour rebuild et replay, le dossier des résultats est indiqué par --output et les XLSM d’origine restent inchangés.</w:t>
       </w:r>
     </w:p>
     <w:p>
@@ -5295,7 +5295,7 @@
     </w:p>
     <w:p>
       <w:r>
-        <w:t>EU : score de cycle fondé sur la moyenne de trois composantes, puis deux filtres de régime (seuils enregistrés dans le fichier, actuellement 0,05 et 0,10). US : 30 % + 30 % + 30 % + 10 % sur quatre composantes macro. Le cycle se lit en C, R, E ou SD.</w:t>
+        <w:t>EU : le score U combine quatre composantes, dont la première est décalée d’un mois ; le cycle retenu est AB. US : le score Q combine quatre indicateurs à 30 % / 30 % / 30 % / 10 %, et le cycle retenu est U. Les régimes sont C, R, E ou SD, selon les formules enregistrées dans le fichier macro.</w:t>
       </w:r>
     </w:p>
     <w:p>

</xml_diff>

<commit_message>
Simplifier le choix du mode et documenter Excel COM
</commit_message>
<xml_diff>
--- a/docs/Guide_production_modele_sectoriel.docx
+++ b/docs/Guide_production_modele_sectoriel.docx
@@ -242,7 +242,7 @@
               <w:rPr>
                 <w:b/>
               </w:rPr>
-              <w:t>Score_Sectoriel_EU.xlsm et Score_Sectoriel_US.xlsm</w:t>
+              <w:t>Score_Sectoriel_EU_NEW.xlsm et Score_Sectoriel_US_NEW.xlsm</w:t>
             </w:r>
           </w:p>
         </w:tc>
@@ -3817,7 +3817,7 @@
     </w:p>
     <w:p>
       <w:r>
-        <w:t>actualiser_excel.py utilise production par défaut : Excel complète data_history.xlsx, puis Output, Reco_histo et Dashboard sont actualisés. rebuild crée un nouvel historique à partir des Excel ; replay recalcule le modèle à partir du seul historique figé, sans ouvrir Excel. Pour rebuild et replay, le dossier des résultats est indiqué par --output et les XLSM d’origine restent inchangés.</w:t>
+        <w:t>actualiser_excel.py utilise production par défaut : Excel complète data_history.xlsx, puis Output, Reco_histo et Dashboard sont actualisés. rebuild crée un nouvel historique à partir des Excel ; replay recalcule le modèle à partir du seul historique figé, sans ouvrir Excel. Pour rebuild et replay, régler les paramètres dans l’appel main(...) en fin de script ; les XLSM d’origine restent inchangés.</w:t>
       </w:r>
     </w:p>
     <w:p>

</xml_diff>

<commit_message>
Separate research and streamline sector model exports
</commit_message>
<xml_diff>
--- a/docs/Guide_production_modele_sectoriel.docx
+++ b/docs/Guide_production_modele_sectoriel.docx
@@ -436,7 +436,7 @@
     </w:p>
     <w:p>
       <w:r>
-        <w:t>Les fichiers XLSM sont aussi les modèles de présentation : Output est actualisé en valeurs, tandis que le Dashboard conserve ses formules, formats et graphiques. Reco_histo reçoit les nouveaux mois de signal.</w:t>
+        <w:t>Les fichiers XLSM sont aussi les modèles de présentation : Output est actualisé en valeurs, tandis que le Dashboard conserve ses formules, formats et graphiques. Reco_histo reçoit les nouveaux mois de signal. Le fichier reco_secto_facto.xlsx détaille en parallèle les déviations par supersecteur à la date d’allocation, avec un total nul par marché.</w:t>
       </w:r>
     </w:p>
     <w:p>
@@ -713,7 +713,7 @@
               <w:pStyle w:val="TableNormal"/>
             </w:pPr>
             <w:r>
-              <w:t>*_output.xlsx, CSV de recommandations et de performances, ainsi que actualisation.txt.</w:t>
+              <w:t>*_output.xlsx, tableaux Excel de recommandations et de performances, ainsi que actualisation.txt.</w:t>
             </w:r>
           </w:p>
         </w:tc>
@@ -3238,7 +3238,7 @@
               <w:rPr>
                 <w:sz w:val="17"/>
               </w:rPr>
-              <w:t>Exports CSV et grilles Output par marché dans output/</w:t>
+              <w:t>Exports Excel et grilles Output par marché dans output/</w:t>
             </w:r>
           </w:p>
         </w:tc>
@@ -3822,7 +3822,7 @@
     </w:p>
     <w:p>
       <w:r>
-        <w:t>La mise à jour des valeurs Output et de Reco_histo intervient après le calcul EU et US. Les macros de rafraîchissement FactSet/Bloomberg sont distinctes du lancement Python.</w:t>
+        <w:t>Après les calculs EU et US, la production actualise Output, Reco_histo et reco_secto_facto.xlsx. Dans ce dernier, la répartition des 19 supersecteurs est expliquée sur l’onglet Mapping. Les macros FactSet/Bloomberg restent distinctes de ce lancement.</w:t>
       </w:r>
     </w:p>
     <w:p>

</xml_diff>

<commit_message>
Remove batch launcher and use Python directly
</commit_message>
<xml_diff>
--- a/docs/Guide_production_modele_sectoriel.docx
+++ b/docs/Guide_production_modele_sectoriel.docx
@@ -113,7 +113,7 @@
         <w:t xml:space="preserve">3.  Lancer le modèle.  </w:t>
       </w:r>
       <w:r>
-        <w:t>Exécuter Actualiser.bat, ou python actualiser_excel.py. Le programme calcule les deux marchés, remplit Output, complète Reco_histo et actualise les graphiques.</w:t>
+        <w:t>Exécuter python actualiser_excel.py. Le programme calcule les deux marchés, remplit Output, complète Reco_histo, actualise les graphiques et ouvre les deux classeurs.</w:t>
       </w:r>
     </w:p>
     <w:p>
@@ -2876,7 +2876,7 @@
               <w:rPr>
                 <w:b/>
               </w:rPr>
-              <w:t>actualiser_excel.py / Actualiser.bat</w:t>
+              <w:t>actualiser_excel.py</w:t>
             </w:r>
           </w:p>
         </w:tc>
@@ -3025,7 +3025,7 @@
                 <w:color w:val="183049"/>
                 <w:sz w:val="18"/>
               </w:rPr>
-              <w:t>1  Actualiser.bat / actualiser_excel.main()</w:t>
+              <w:t>1  actualiser_excel.py / main()</w:t>
             </w:r>
           </w:p>
           <w:p>
@@ -3817,7 +3817,7 @@
     </w:p>
     <w:p>
       <w:r>
-        <w:t>actualiser_excel.py utilise production par défaut : Excel complète data_history.xlsx, puis Output, Reco_histo et Dashboard sont actualisés. rebuild crée un nouvel historique à partir des Excel ; replay recalcule le modèle à partir du seul historique figé, sans ouvrir Excel. Pour rebuild et replay, régler les paramètres dans l’appel main(...) en fin de script ; les XLSM d’origine restent inchangés.</w:t>
+        <w:t>actualiser_excel.py utilise production par défaut : Excel complète data_history.xlsx, puis Output, Reco_histo et Dashboard sont actualisés. rebuild crée un nouvel historique à partir des Excel ; replay recalcule le modèle à partir du seul historique figé, sans ouvrir Excel. Pour rebuild et replay, régler le mode et les paramètres en fin de script ; les XLSM d’origine restent inchangés.</w:t>
       </w:r>
     </w:p>
     <w:p>

</xml_diff>

<commit_message>
Keep the Word guide as the sole project document
</commit_message>
<xml_diff>
--- a/docs/Guide_production_modele_sectoriel.docx
+++ b/docs/Guide_production_modele_sectoriel.docx
@@ -98,7 +98,7 @@
         <w:t xml:space="preserve">2.  Enregistrer les entrées.  </w:t>
       </w:r>
       <w:r>
-        <w:t>Enregistrer les résultats recalculés, puis fermer les deux classeurs sectoriels, le fichier macro et data_history.xlsx.</w:t>
+        <w:t>Enregistrer les résultats recalculés, puis fermer les deux classeurs sectoriels, le fichier macro, data_history.xlsx et reco_secto_facto.xlsx.</w:t>
       </w:r>
     </w:p>
     <w:p>
@@ -3817,7 +3817,7 @@
     </w:p>
     <w:p>
       <w:r>
-        <w:t>actualiser_excel.py utilise production par défaut : Excel complète data_history.xlsx, puis Output, Reco_histo et Dashboard sont actualisés. rebuild crée un nouvel historique à partir des Excel ; replay recalcule le modèle à partir du seul historique figé, sans ouvrir Excel. Pour rebuild et replay, régler le mode et les paramètres en fin de script ; les XLSM d’origine restent inchangés.</w:t>
+        <w:t>actualiser_excel.py utilise production par défaut : le programme complète data_history.xlsx, puis Output, Reco_histo et Dashboard sont actualisés. rebuild crée un nouvel historique à partir des Excel ; replay recalcule le modèle à partir du seul historique figé, sans ouvrir Excel. Pour rebuild et replay, régler le mode et les paramètres en fin de script ; les XLSM d’origine restent inchangés.</w:t>
       </w:r>
     </w:p>
     <w:p>
@@ -6115,7 +6115,85 @@
     </w:p>
     <w:p>
       <w:r>
-        <w:t>Variables, exclusions sectorielles, poids de régime et mappings : local_config.py. Lecture des entrées et historique : data_utils.py. Scores, seuils et votes : model_secto.py. Portefeuille et tableaux : excel_output.py. Le guide décrit ces principes ; les adresses Excel restent dans le code.</w:t>
+        <w:t>Paramètres du modèle : local_config.py. Lecture des entrées et historique : data_utils.py. Scores, seuils et votes : model_secto.py. Portefeuille et tableaux : excel_output.py. Les signaux ICB sont mis à jour par sector_deviations.py ; leur répartition reste dans le classeur d'allocation.</w:t>
+      </w:r>
+    </w:p>
+    <w:p>
+      <w:pPr>
+        <w:pStyle w:val="Heading1"/>
+        <w:pageBreakBefore/>
+      </w:pPr>
+      <w:r>
+        <w:t>ANNEXE D — Utilisation pratique</w:t>
+      </w:r>
+    </w:p>
+    <w:p>
+      <w:pPr>
+        <w:pStyle w:val="Heading2"/>
+      </w:pPr>
+      <w:r>
+        <w:t>D1. Installation et choix du mode</w:t>
+      </w:r>
+    </w:p>
+    <w:p>
+      <w:r>
+        <w:t>Sur Windows avec Excel, installer les dépendances depuis le dossier du projet : python -m pip install -r requirements.txt. Le programme ne filtre pas le mois en cours ; vérifier qu'il est terminé avant de lancer la production.</w:t>
+      </w:r>
+    </w:p>
+    <w:p>
+      <w:r>
+        <w:t>En fin de actualiser_excel.py, choisir mode et les paramètres de main(...), puis lancer python actualiser_excel.py. production est le mode par défaut : il actualise les classeurs et les ouvre après réussite.</w:t>
+      </w:r>
+    </w:p>
+    <w:p>
+      <w:r>
+        <w:t>rebuild et replay exigent un output_dir vide, distinct du projet et de output/. rebuild crée un nouvel historique depuis les Excel et demande history_file=None. replay lit le snapshot choisi par history_file (None = data_history.xlsx du projet), sans ouvrir les Excel source. Ces deux modes ne modifient pas les XLSM.</w:t>
+      </w:r>
+    </w:p>
+    <w:p>
+      <w:r>
+        <w:t>Exemples : choisir mode = "rebuild" et output_dir="output/rebuild_octobre" ; ou mode = "replay", output_dir="output/replay_test" et history_file="output/rebuild_octobre/data_history.xlsx". output_dir et history_file se règlent dans main(...).</w:t>
+      </w:r>
+    </w:p>
+    <w:p>
+      <w:pPr>
+        <w:pStyle w:val="Heading2"/>
+      </w:pPr>
+      <w:r>
+        <w:t>D2. Déviations sur les 19 supersecteurs</w:t>
+      </w:r>
+    </w:p>
+    <w:p>
+      <w:r>
+        <w:t>La production écrit les recommandations dans Signals_EU et Signals_US du classeur existant reco_secto_facto.xlsx. Excel calcule les feuilles secto_eu et secto_us ; les formules et la présentation sont conservées. La date affichée est le premier jour du mois suivant le signal. Le chemin se règle avec SECTOR_DEVIATION_EXCEL_FILE dans local_config.py.</w:t>
+      </w:r>
+    </w:p>
+    <w:p>
+      <w:r>
+        <w:t>Mapping!I2 fixe l'amplitude (5 % actuellement). Les parts sont en colonnes C/E ; modifier seulement les noms en B/D ne change pas les références aux signaux dans les formules. En EU : Fin se répartit 60/20/20 entre Banks, Financial Services et Insurance ; Materials 50/50 entre Basic Resources et Chemicals ; Indus 80/20 entre Industrial Goods &amp; Services et Construction &amp; Materials. En US, Fin et Materials sont chacun divisés en trois parts égales.</w:t>
+      </w:r>
+    </w:p>
+    <w:p>
+      <w:r>
+        <w:t>Les positions positives et négatives sont équilibrées pour obtenir un total nul par marché et par mois. S'il n'existe qu'un seul côté, les déviations sont nulles.</w:t>
+      </w:r>
+    </w:p>
+    <w:p>
+      <w:pPr>
+        <w:pStyle w:val="Heading2"/>
+      </w:pPr>
+      <w:r>
+        <w:t>D3. Recherche et fichiers locaux</w:t>
+      </w:r>
+    </w:p>
+    <w:p>
+      <w:r>
+        <w:t>Le dossier research/ contient research_secto.ipynb et les notebooks d'audit EU/US. En Python, importer SectorResearch avec : from research.research_secto import SectorResearch. Choisir les variables avant le calcul ; les backtests de recherche sont distincts du portefeuille de production.</w:t>
+      </w:r>
+    </w:p>
+    <w:p>
+      <w:r>
+        <w:t>output/ contient les résultats courants et la sauvegarde avant actualisation. archive/ conserve les anciens essais et documents. Ces deux dossiers sont exclus de Git et restent locaux : les copier séparément si leurs fichiers sont nécessaires sur un autre ordinateur.</w:t>
       </w:r>
     </w:p>
     <w:sectPr>

</xml_diff>

<commit_message>
Convert sector workbooks to portable macro-free Excel files
</commit_message>
<xml_diff>
--- a/docs/Guide_production_modele_sectoriel.docx
+++ b/docs/Guide_production_modele_sectoriel.docx
@@ -12,7 +12,7 @@
           <w:color w:val="18646E"/>
           <w:sz w:val="16"/>
         </w:rPr>
-        <w:t>RECHERCHE QUANTITATIVE  /  ROTATION SECTORIELLE</w:t>
+        <w:t>GUIDE DU MODÈLE SECTORIEL</w:t>
       </w:r>
     </w:p>
     <w:p>
@@ -42,12 +42,12 @@
           <w:color w:val="626D79"/>
           <w:sz w:val="17"/>
         </w:rPr>
-        <w:t>Octobre 2026  •  Documentation fonctionnelle</w:t>
+        <w:t>Octobre 2026  •  Guide pratique</w:t>
       </w:r>
     </w:p>
     <w:p>
       <w:r>
-        <w:t>Le modèle classe les secteurs en Europe et aux États-Unis et produit chaque mois des recommandations Positive, Neutral et Negative. Les données sont préparées dans Excel, les calculs dans Python et les résultats présentés dans les classeurs EU et US.</w:t>
+        <w:t>Le modèle compare les secteurs en Europe (EU) et aux États-Unis (US). Chaque mois, il donne une recommandation Positive, Neutral ou Negative pour chaque secteur. Les données viennent d'Excel. Python fait les calculs et écrit les résultats dans Excel.</w:t>
       </w:r>
     </w:p>
     <w:p>
@@ -83,7 +83,7 @@
         <w:t xml:space="preserve">1.  Actualiser les données.  </w:t>
       </w:r>
       <w:r>
-        <w:t>Rafraîchir les séries FactSet et Bloomberg dans les classeurs EU/US, ainsi que maj cycle macro2.xlsx. Compléter les poids sectoriels dans Bench et le taux US à 10 ans dans Cycle macro.</w:t>
+        <w:t>Dans les classeurs EU et US et dans maj cycle macro2.xlsx, actualiser les données FactSet/Bloomberg. Vérifier les poids dans Bench et le taux US à 10 ans dans Cycle macro.</w:t>
       </w:r>
     </w:p>
     <w:p>
@@ -98,7 +98,7 @@
         <w:t xml:space="preserve">2.  Enregistrer les entrées.  </w:t>
       </w:r>
       <w:r>
-        <w:t>Enregistrer les résultats recalculés, puis fermer les deux classeurs sectoriels, le fichier macro, data_history.xlsx et reco_secto_facto.xlsx.</w:t>
+        <w:t>Enregistrer les fichiers, puis fermer les deux classeurs sectoriels, le fichier macro, data_history.xlsx et reco_secto_facto.xlsx.</w:t>
       </w:r>
     </w:p>
     <w:p>
@@ -113,7 +113,7 @@
         <w:t xml:space="preserve">3.  Lancer le modèle.  </w:t>
       </w:r>
       <w:r>
-        <w:t>Exécuter python actualiser_excel.py. Le programme calcule les deux marchés, remplit Output, complète Reco_histo, actualise les graphiques et ouvre les deux classeurs.</w:t>
+        <w:t>Dans le dossier du projet, lancer python actualiser_excel.py. Le programme calcule EU et US, met à jour Output, Reco_histo et les graphiques, puis ouvre les deux classeurs.</w:t>
       </w:r>
     </w:p>
     <w:p>
@@ -128,17 +128,17 @@
         <w:t xml:space="preserve">4.  Lire et archiver.  </w:t>
       </w:r>
       <w:r>
-        <w:t>Consulter output/actualisation.txt, vérifier les dates et les recommandations dans le Dashboard, puis conserver la version diffusée avec les sources mensuelles.</w:t>
+        <w:t>Lire output/actualisation.txt. Vérifier les dates et les recommandations dans Dashboard, puis conserver les fichiers du mois.</w:t>
       </w:r>
     </w:p>
     <w:p>
       <w:r>
-        <w:t>En cas d’écart, consulter d’abord la date des sources macro et fondamentales, puis le taux. Un n.a. renvoie à la mesure source. Pour un fichier Excel en lecture seule, fermer le classeur concerné et relancer.</w:t>
+        <w:t>Si un résultat manque (n.a.), vérifier d'abord les données et leurs dates, puis le taux US à 10 ans. Si un fichier s'ouvre en lecture seule, le fermer et relancer.</w:t>
       </w:r>
     </w:p>
     <w:p>
       <w:r>
-        <w:t>La dernière sauvegarde automatique est placée dans output/avant_actualisation. Les archives des mois validés sont conservées séparément.</w:t>
+        <w:t>Une copie des fichiers avant le calcul est placée dans output/avant_actualisation. Garder séparément les fichiers validés de chaque mois.</w:t>
       </w:r>
     </w:p>
     <w:p>
@@ -146,7 +146,7 @@
         <w:pStyle w:val="Heading1"/>
       </w:pPr>
       <w:r>
-        <w:t>2. Données et fonctionnement du pipeline</w:t>
+        <w:t>2. Données et calcul</w:t>
       </w:r>
     </w:p>
     <w:tbl>
@@ -242,7 +242,7 @@
               <w:rPr>
                 <w:b/>
               </w:rPr>
-              <w:t>Score_Sectoriel_EU_NEW.xlsm et Score_Sectoriel_US_NEW.xlsm</w:t>
+              <w:t>Score_Sectoriel_EU_NEW.xlsx et Score_Sectoriel_US_NEW.xlsx</w:t>
             </w:r>
           </w:p>
         </w:tc>
@@ -431,17 +431,17 @@
     </w:p>
     <w:p>
       <w:r>
-        <w:t>data_utils.py lit les séries et gère l’historique ; model_secto.py calcule les sous-scores, les piliers, les rangs, le contexte macro et les recommandations ; excel_output.py écrit les résultats dans les classeurs et crée les exports.</w:t>
+        <w:t>data_utils.py lit les données et conserve leur historique. model_secto.py calcule les scores et les recommandations. excel_output.py écrit les résultats dans les fichiers Excel.</w:t>
       </w:r>
     </w:p>
     <w:p>
       <w:r>
-        <w:t>Les fichiers XLSM sont aussi les modèles de présentation : Output est actualisé en valeurs, tandis que le Dashboard conserve ses formules, formats et graphiques. Reco_histo reçoit les nouveaux mois de signal. Le fichier reco_secto_facto.xlsx détaille en parallèle les déviations par supersecteur à la date d’allocation, avec un total nul par marché.</w:t>
+        <w:t>Les deux classeurs gardent leur présentation. Python écrit les valeurs dans Output et conserve les formules, les formats et les graphiques du Dashboard. Reco_histo reçoit les nouveaux mois. reco_secto_facto.xlsx répartit les recommandations sur les 19 supersecteurs.</w:t>
       </w:r>
     </w:p>
     <w:p>
       <w:r>
-        <w:t>L’historique des entrées dans data_history.xlsx et l’historique des recommandations dans Reco_histo jouent deux rôles distincts.</w:t>
+        <w:t>data_history.xlsx garde les données utilisées pour le calcul. Reco_histo garde les recommandations passées. Ces deux historiques ont donc des rôles différents.</w:t>
       </w:r>
     </w:p>
     <w:p>
@@ -726,7 +726,7 @@
     </w:p>
     <w:p>
       <w:r>
-        <w:t>La date du signal correspond à la fin du mois étudié ; l’allocation affichée s’applique au mois suivant. L’historique récent d’Output porte sur 15 mois, et les mini-historiques présentent 60 mois de données.</w:t>
+        <w:t>La date du signal est la fin du mois étudié. La répartition proposée s'applique au mois suivant. Output montre 15 mois récents et les petits graphiques montrent 60 mois.</w:t>
       </w:r>
     </w:p>
     <w:p>
@@ -734,7 +734,7 @@
         <w:pStyle w:val="Heading2"/>
       </w:pPr>
       <w:r>
-        <w:t>Benchmarks</w:t>
+        <w:t>Indice de référence (benchmark)</w:t>
       </w:r>
     </w:p>
     <w:tbl>
@@ -981,7 +981,7 @@
     </w:p>
     <w:p>
       <w:r>
-        <w:t>Les identifiants de rendements et de poids ci-dessus sont ceux des classeurs actuels. Le benchmark retenu pour la gestion et la communication doit être cohérent entre séries et pondérations.</w:t>
+        <w:t>Le benchmark est l'indice utilisé pour comparer la performance. Vérifier que la série de rendement et les poids utilisés sont cohérents.</w:t>
       </w:r>
     </w:p>
     <w:p>
@@ -989,12 +989,12 @@
         <w:pStyle w:val="Heading1"/>
       </w:pPr>
       <w:r>
-        <w:t>4. Univers sectoriels et variables</w:t>
+        <w:t>4. Secteurs et variables</w:t>
       </w:r>
     </w:p>
     <w:p>
       <w:r>
-        <w:t>Le modèle couvre 13 secteurs EU et 12 secteurs US. EU comprend Pers. Goods et Auto ; US comprend Retail à la place de Pers. Goods et ne comporte pas Auto. Les calculs de rang restent propres à chaque marché.</w:t>
+        <w:t>Le modèle utilise 13 secteurs en EU et 12 en US. EU comprend Pers. Goods et Auto. US comprend Retail à la place de Pers. Goods et ne comprend pas Auto. Chaque marché est classé séparément.</w:t>
       </w:r>
     </w:p>
     <w:tbl>
@@ -1519,17 +1519,17 @@
     </w:p>
     <w:p>
       <w:r>
-        <w:t>Sens favorable : moins d’endettement, des valorisations plus faibles et une volatilité plus basse ; des marges, une croissance, un momentum et une capacité de remboursement plus élevés.</w:t>
+        <w:t>En général, une dette, une valorisation ou une volatilité plus faible est favorable. Des marges, une croissance, un momentum ou une capacité de remboursement plus élevés sont favorables.</w:t>
       </w:r>
     </w:p>
     <w:p>
       <w:r>
-        <w:t>Exceptions de composition : Fin utilise ev_ebitda + price_sales pour Value EU et pe + price_sales pour Value US. Pour Growth, Fin utilise eps_growth + sales_growth dans les deux marchés. Tech utilise price_fcf + ev_ebitda pour Value.</w:t>
+        <w:t>Certains secteurs utilisent des variables différentes. Pour Value, Fin utilise ev_ebitda et price_sales en EU, puis pe et price_sales en US. Pour Growth, Fin utilise eps_growth et sales_growth dans les deux marchés. Tech utilise price_fcf et ev_ebitda pour Value.</w:t>
       </w:r>
     </w:p>
     <w:p>
       <w:r>
-        <w:t>La règle de votes de Travel &amp; leisure est spécifique depuis octobre 2011 : ses compteurs Top et Worst sont ramenés à zéro.</w:t>
+        <w:t>Depuis octobre 2011, Travel &amp; leisure ne reçoit pas de vote Top ou Worst.</w:t>
       </w:r>
     </w:p>
     <w:p>
@@ -1538,7 +1538,7 @@
         <w:pageBreakBefore/>
       </w:pPr>
       <w:r>
-        <w:t>5. Calcul des sous-scores et des piliers</w:t>
+        <w:t>5. Comment les scores sont calculés</w:t>
       </w:r>
     </w:p>
     <w:p>
@@ -1551,12 +1551,12 @@
     </w:p>
     <w:p>
       <w:r>
-        <w:t>Pour chaque variable, la valeur du secteur est comparée à la moyenne sectorielle du mois. L’écart obtenu est ensuite classé dans son historique ; une valeur orientée favorable obtient un score plus élevé.</w:t>
+        <w:t>Pour chaque mois, le modèle calcule l'écart entre la valeur du secteur et la moyenne des secteurs. Il compare ensuite cet écart avec les écarts passés du même secteur. Un écart favorable reçoit un score plus élevé.</w:t>
       </w:r>
     </w:p>
     <w:p>
       <w:r>
-        <w:t>H = 10 × rang favorable de l’écart / nombre d’observations. La fenêtre ordinaire comporte 61 observations, mois courant compris ; elle en comporte 37 pour les deux multiples price_fcf et ev_ebitda de Tech.</w:t>
+        <w:t>H = 10 × rang de l'écart / taille de la fenêtre. La fenêtre compte 61 mois : le mois en cours et les 60 mois précédents. Pour price_fcf et ev_ebitda de Tech, elle compte 37 mois. Le calcul utilise ces nombres même si certaines valeurs manquent.</w:t>
       </w:r>
     </w:p>
     <w:p>
@@ -1564,12 +1564,12 @@
         <w:pStyle w:val="Heading2"/>
       </w:pPr>
       <w:r>
-        <w:t>Score transversal X</w:t>
+        <w:t>Score du mois X</w:t>
       </w:r>
     </w:p>
     <w:p>
       <w:r>
-        <w:t>Certaines variables ajoutent le classement entre secteurs : X = 10 × rang favorable de la valeur brute / nombre de secteurs. Le sous-score final vaut (H + X) / 2. Ce calcul H+X est utilisé pour Margin dans les deux marchés et pour Leverage US. Les autres variables fondamentales utilisent H.</w:t>
+        <w:t>X classe les valeurs brutes de tous les secteurs du même mois et donne une note sur 10. Pour Margin en EU et US et pour Leverage en US, le score final de la variable est la moyenne de H et X. Les autres variables fondamentales utilisent H.</w:t>
       </w:r>
     </w:p>
     <w:p>
@@ -1577,12 +1577,12 @@
         <w:pStyle w:val="Heading2"/>
       </w:pPr>
       <w:r>
-        <w:t>Du sous-score au pilier</w:t>
+        <w:t>Du score de chaque variable au pilier</w:t>
       </w:r>
     </w:p>
     <w:p>
       <w:r>
-        <w:t>Chaque pilier est la moyenne des sous-scores sélectionnés. Le secteur au score de pilier le plus favorable reçoit le rang interne le plus élevé. Les sous-scores sélectionnés doivent être disponibles pour construire le pilier.</w:t>
+        <w:t>Un pilier est un groupe de variables. Son score est la moyenne des scores prévus pour le secteur. Si un score nécessaire manque, le score du pilier manque aussi. Les secteurs sont ensuite classés selon ce score.</w:t>
       </w:r>
     </w:p>
     <w:p>
@@ -1603,12 +1603,12 @@
     </w:p>
     <w:p>
       <w:r>
-        <w:t>Le pilier combine deux variations de prix (horizons 6 et 12 mois, en excluant habituellement le prix du mois courant) et la balance des révisions bénéficiaires : (hausses − baisses) / (hausses + baisses + stables). Pour Tech, les deux variations utilisent le prix courant.</w:t>
+        <w:t>Momentum utilise les variations de prix sur 6 et 12 mois et les révisions des prévisions de bénéfices. Les calculs de prix excluent normalement le mois en cours. Pour Tech, ils l'incluent.</w:t>
       </w:r>
     </w:p>
     <w:p>
       <w:r>
-        <w:t>Ces trois mesures sont classées entre secteurs, puis moyennées. EU convertit les rangs sur une échelle 0–10 ; US utilise le rang brut.</w:t>
+        <w:t>Le programme classe chaque mesure entre les secteurs, puis fait la moyenne des trois rangs. En EU, les rangs sont transformés en notes sur 10. En US, les rangs restent bruts.</w:t>
       </w:r>
     </w:p>
     <w:p>
@@ -1621,12 +1621,12 @@
     </w:p>
     <w:p>
       <w:r>
-        <w:t>Les rendements sont calculés à partir des indices de Returns_EQ. La volatilité totale utilise l’écart-type annualisé sur 7 observations mensuelles. La volatilité baissière retient l’écart-type des rendements négatifs parmi 19 observations, avec annualisation par √12.</w:t>
+        <w:t>La volatilité mesure l'ampleur des variations de rendement. Le modèle utilise 7 mois pour la volatilité totale et les rendements négatifs de 19 mois pour la volatilité baissière. Les deux sont annualisées avec √12.</w:t>
       </w:r>
     </w:p>
     <w:p>
       <w:r>
-        <w:t>Les deux mesures reçoivent un score historique orienté favorablement aux secteurs les moins volatils, puis sont moyennées.</w:t>
+        <w:t>Chaque mesure reçoit un score historique. Une volatilité plus faible donne un meilleur score. Le pilier est la moyenne des deux scores.</w:t>
       </w:r>
     </w:p>
     <w:p>
@@ -1639,12 +1639,12 @@
     </w:p>
     <w:p>
       <w:r>
-        <w:t>Le fichier macro fournit les scores et cycles enregistrés dans Excel. EU : moyenne de quatre composantes (score U) et cycle filtré AB. US : quatre composantes pondérées à 30 % / 30 % / 30 % / 10 % (score Q) et cycle filtré U.</w:t>
+        <w:t>Le fichier macro donne un score et un cycle. En EU, le score est en U et le cycle en AB. En US, le score est en Q et le cycle en U. Le score EU est la moyenne de quatre indicateurs ; le score US utilise les poids 30/30/30/10.</w:t>
       </w:r>
     </w:p>
     <w:p>
       <w:r>
-        <w:t>Selon le niveau et la direction du score, le régime est Expansion (E), Recovery (R), Slowdown (SD) ou Contraction (C). Il choisit les pondérations du rang de tilt macro :</w:t>
+        <w:t>Le cycle peut être Expansion (E), Recovery (R), Slowdown (SD) ou Contraction (C). Il détermine le poids de chaque pilier dans le score ajusté au cycle, appelé tilt :</w:t>
       </w:r>
     </w:p>
     <w:tbl>
@@ -2308,7 +2308,7 @@
     </w:p>
     <w:p>
       <w:r>
-        <w:t>Le signal de taux lisse le 10 ans US par une moyenne exponentielle (coefficient 0,715). Lorsque l’écart du taux à ce lissage dépasse son 85ᵉ percentile historique, le signal passe à On et augmente les votes liés à Leverage et Value.</w:t>
+        <w:t>Le taux US à 10 ans est comparé à sa moyenne mobile exponentielle (0,715). Si l'écart dépasse son 85ᵉ percentile historique, le signal passe à On et ajoute des votes pour Leverage et Value.</w:t>
       </w:r>
     </w:p>
     <w:p>
@@ -2321,17 +2321,17 @@
     </w:p>
     <w:p>
       <w:r>
-        <w:t>Le modèle calcule un score de base à partir des rangs des piliers, puis un score de tilt avec les poids du régime. Le rang de ce tilt rejoint les rangs fondamentaux dans le score global : six piliers plus Macro en EU, cinq piliers (sans Margin) plus Macro en US.</w:t>
+        <w:t>Le programme calcule un score de base et un score ajusté au cycle (tilt) à partir des rangs des piliers. Le rang du tilt devient le rang Macro du classement global. En EU, ce classement utilise six piliers et Macro ; en US, cinq piliers et Macro.</w:t>
       </w:r>
     </w:p>
     <w:p>
       <w:r>
-        <w:t>Chaque pilier apporte un vote Top ou Worst lorsque le secteur entre dans les trois premières ou dernières positions. Le tilt macro ajoute deux votes en EU et un vote en US. Le signal de taux On ajoute un vote pour Leverage et Value. Margin est exclu des votes Worst US.</w:t>
+        <w:t>Pour chaque pilier, les trois premiers secteurs reçoivent un vote Top et les trois derniers un vote Worst. Le tilt ajoute deux votes en EU et un vote en US. Quand le signal de taux est On, Leverage et Value comptent une fois de plus pour les secteurs classés Top ou Worst. Margin ne donne pas de vote Worst en US.</w:t>
       </w:r>
     </w:p>
     <w:p>
       <w:r>
-        <w:t>Les listes Positive et Negative sont départagées par le nombre de votes et par le rang global, avec une limite de trois secteurs par groupe. Positive est prioritaire lorsque les deux sélections se recoupent ; les autres secteurs sont Neutral.</w:t>
+        <w:t>Le programme choisit au maximum trois secteurs Positive et trois Negative selon les votes et le rang global. Si un secteur apparaît dans les deux listes, Positive est prioritaire. Les autres secteurs sont Neutral.</w:t>
       </w:r>
     </w:p>
     <w:p>
@@ -2344,7 +2344,7 @@
     </w:p>
     <w:p>
       <w:r>
-        <w:t>Pour le rendement du mois t, le modèle utilise les recommandations émises au mois t−1 et les derniers poids Bench disponibles. Il ajuste chaque poids sectoriel puis normalise le portefeuille.</w:t>
+        <w:t>Pour calculer le rendement d'un mois, le modèle prend les recommandations du mois précédent et les derniers poids disponibles dans Bench. Il ajuste les poids selon la recommandation, puis les ramène à un total de 100 %.</w:t>
       </w:r>
     </w:p>
     <w:tbl>
@@ -2571,12 +2571,12 @@
     </w:p>
     <w:p>
       <w:r>
-        <w:t>Rendement portefeuille = somme(poids ajusté × rendement) / somme(poids ajustés). Top et Bottom correspondent à la moyenne des rendements des secteurs recommandés ; Long/Short = Top − Bottom. Les courbes sont indexées à 100.</w:t>
+        <w:t>Le rendement du portefeuille est la moyenne des rendements sectoriels, pondérée par les poids ajustés. Top et Bottom sont les rendements moyens des groupes recommandés. Long/Short = Top − Bottom. Les courbes commencent à 100.</w:t>
       </w:r>
     </w:p>
     <w:p>
       <w:r>
-        <w:t>Les vues de performance couvrent 1M, 3M, YTD, 1Y, 3Y, 5Y, l’historique complet et un zoom sur un an. Les résultats sont calculés avant coûts de transaction.</w:t>
+        <w:t>Les résultats sont affichés sur 1 mois, 3 mois, depuis le début de l'année (YTD), 1 an, 3 ans, 5 ans, tout l'historique et un zoom sur 1 an. Ils ne comprennent pas les coûts de transaction.</w:t>
       </w:r>
     </w:p>
     <w:p>
@@ -2848,7 +2848,7 @@
               <w:pStyle w:val="TableNormal"/>
             </w:pPr>
             <w:r>
-              <w:t>Output, portefeuille, exports et mise à jour des modèles XLSM.</w:t>
+              <w:t>Output, portefeuille, exports et mise à jour des modèles XLSX.</w:t>
             </w:r>
           </w:p>
         </w:tc>
@@ -2959,7 +2959,7 @@
     </w:p>
     <w:p>
       <w:r>
-        <w:t>Les correspondances techniques de colonnes, les paramètres et les fonctions détaillées sont regroupés dans le code, au plus près de leur utilisation.</w:t>
+        <w:t>Les colonnes Excel, les paramètres et les fonctions sont indiqués dans le code.</w:t>
       </w:r>
     </w:p>
     <w:p>
@@ -2967,7 +2967,7 @@
         <w:rPr>
           <w:i/>
         </w:rPr>
-        <w:t>Les annexes présentent les appels entre les fichiers Python, les transformations détaillées et les règles de décision.</w:t>
+        <w:t>Les annexes expliquent les étapes Python et les calculs.</w:t>
       </w:r>
     </w:p>
     <w:p>
@@ -2981,12 +2981,12 @@
         <w:keepNext/>
       </w:pPr>
       <w:r>
-        <w:t>ANNEXE A — Architecture et appels Python</w:t>
+        <w:t>ANNEXE A — Les étapes du programme</w:t>
       </w:r>
     </w:p>
     <w:p>
       <w:r>
-        <w:t>Le même calcul Python sert aux trois modes : production, reconstruction historique et replay. Le schéma suivant décrit le parcours mensuel de production.</w:t>
+        <w:t>Le même calcul sert aux trois modes : production, rebuild et replay. Le schéma montre les étapes de la production mensuelle.</w:t>
       </w:r>
     </w:p>
     <w:tbl>
@@ -3305,7 +3305,7 @@
               <w:rPr>
                 <w:sz w:val="17"/>
               </w:rPr>
-              <w:t>Copies temporaires des XLSM → fill_workbook() → Output, Reco_histo, Dashboard</w:t>
+              <w:t>Copies temporaires des XLSX → fill_workbook() → Output, Reco_histo, Dashboard</w:t>
             </w:r>
           </w:p>
         </w:tc>
@@ -3317,7 +3317,7 @@
         <w:keepNext/>
       </w:pPr>
       <w:r>
-        <w:t>A1. Répartition des responsabilités</w:t>
+        <w:t>A1. Rôle des fichiers</w:t>
       </w:r>
     </w:p>
     <w:tbl>
@@ -3807,22 +3807,22 @@
         <w:keepNext/>
       </w:pPr>
       <w:r>
-        <w:t>A2. Flux de données et points d’entrée</w:t>
+        <w:t>A2. Comment les fichiers travaillent ensemble</w:t>
       </w:r>
     </w:p>
     <w:p>
       <w:r>
-        <w:t>Les fichiers Score_Sectoriel_*.xlsm et maj cycle macro2.xlsx apportent les données. data_utils.py les lit avec les règles de local_config.py ; model_secto.py calcule les scores ; excel_output.py actualise les mêmes modèles Excel en conservant le Dashboard.</w:t>
+        <w:t>Les deux fichiers Score_Sectoriel_*.xlsx contiennent les données sectorielles. maj cycle macro2.xlsx contient les signaux macro. data_utils.py lit ces données, model_secto.py calcule les scores et excel_output.py met à jour les classeurs.</w:t>
       </w:r>
     </w:p>
     <w:p>
       <w:r>
-        <w:t>actualiser_excel.py utilise production par défaut : le programme complète data_history.xlsx, puis Output, Reco_histo et Dashboard sont actualisés. rebuild crée un nouvel historique à partir des Excel ; replay recalcule le modèle à partir du seul historique figé, sans ouvrir Excel. Pour rebuild et replay, régler le mode et les paramètres en fin de script ; les XLSM d’origine restent inchangés.</w:t>
+        <w:t>Par défaut, actualiser_excel.py utilise le mode production : il complète data_history.xlsx et met à jour Output, Reco_histo et Dashboard. rebuild crée un nouvel historique depuis les Excel. replay recalcule depuis un historique enregistré, sans lire les classeurs sectoriels ou macro. Les deux modes se règlent à la fin du script et ne modifient pas les modèles.</w:t>
       </w:r>
     </w:p>
     <w:p>
       <w:r>
-        <w:t>Après les calculs EU et US, la production actualise Output, Reco_histo et reco_secto_facto.xlsx. Dans ce dernier, la répartition des 19 supersecteurs est expliquée sur l’onglet Mapping. Les macros FactSet/Bloomberg restent distinctes de ce lancement.</w:t>
+        <w:t>Après les calculs EU et US, le programme met aussi à jour reco_secto_facto.xlsx. L'onglet Mapping montre la répartition vers les 19 supersecteurs. Les modèles ne contiennent plus de macros : les données FactSet et Bloomberg doivent être actualisées directement dans Excel avant le calcul.</w:t>
       </w:r>
     </w:p>
     <w:p>
@@ -3836,7 +3836,7 @@
         <w:keepNext/>
       </w:pPr>
       <w:r>
-        <w:t>ANNEXE B — Méthodologie des scores</w:t>
+        <w:t>ANNEXE B — Détail du calcul des scores</w:t>
       </w:r>
     </w:p>
     <w:p>
@@ -3850,7 +3850,7 @@
     </w:p>
     <w:p>
       <w:r>
-        <w:t>H désigne le rang historique de l’écart à la moyenne sectorielle ; H+X ajoute le rang transversal de la valeur brute. Les notations « favorable bas » et « favorable haut » s’appliquent avant calcul du rang.</w:t>
+        <w:t>H compare l'écart d'un secteur avec son propre historique. X compare les valeurs brutes des secteurs au même mois. « Favorable bas » signifie qu'une valeur plus faible est meilleure ; « favorable haut » signifie l'inverse.</w:t>
       </w:r>
     </w:p>
     <w:tbl>
@@ -5242,27 +5242,27 @@
         <w:keepNext/>
       </w:pPr>
       <w:r>
-        <w:t>B2. Calcul des sous-scores</w:t>
+        <w:t>B2. Calcul des scores</w:t>
       </w:r>
     </w:p>
     <w:p>
       <w:r>
-        <w:t>Mesure x(s,t) : valeur du secteur s au mois t. Écart d(s,t) = x(s,t) − moyenne des secteurs au même mois. Certaines variables de Value et Growth excluent Fin de la moyenne de référence ; cette exclusion n’empêche pas automatiquement le calcul du sous-score de Fin.</w:t>
+        <w:t>x(s,t) est la valeur du secteur s au mois t. d(s,t) est son écart à la moyenne des secteurs du même mois. Pour certaines variables de Value et Growth, Fin n'entre pas dans le calcul de la moyenne, mais peut quand même recevoir un score.</w:t>
       </w:r>
     </w:p>
     <w:p>
       <w:r>
-        <w:t>H = 10 × rang favorable de d(s,t) / 61 (mois courant + 60 antérieurs). Pour price_fcf et ev_ebitda de Tech, la fenêtre compte 37 observations. En cas de valeurs égales, le rang minimal du groupe est utilisé.</w:t>
+        <w:t>H = 10 × rang de d(s,t) / taille de la fenêtre. La fenêtre compte 61 mois, dont le mois courant. Pour price_fcf et ev_ebitda de Tech, elle compte 37 mois. Les valeurs manquantes ne sont pas classées, mais le diviseur reste 61 ou 37. En cas d'égalité, le programme utilise le rang minimum.</w:t>
       </w:r>
     </w:p>
     <w:p>
       <w:r>
-        <w:t>X = 10 × rang favorable de x(s,t) / N, avec N = 13 en EU et N = 12 en US. Pour les variables H+X, sous-score = (H + X) / 2.</w:t>
+        <w:t>X = 10 × rang de x(s,t) / nombre de secteurs : 13 en EU et 12 en US. Pour les variables qui utilisent H et X, le score est (H + X) / 2.</w:t>
       </w:r>
     </w:p>
     <w:p>
       <w:r>
-        <w:t>Un pilier est la moyenne simple de ses sous-scores sélectionnés. Ses variables doivent être renseignées pour obtenir un score. Les cas de Fin et Tech définissent des compositions spéciales ; Growth US utilise cash_flow_growth et ebitda_growth par défaut, et eps_growth + sales_growth pour Fin.</w:t>
+        <w:t>Le score d'un pilier est la moyenne des scores des variables prévues pour ce secteur. Les variables nécessaires doivent être disponibles. Fin et Tech ont des compositions particulières. Pour Growth US, le calcul utilise normalement cash_flow_growth et ebitda_growth, et eps_growth et sales_growth pour Fin.</w:t>
       </w:r>
     </w:p>
     <w:p>
@@ -5276,12 +5276,12 @@
     </w:p>
     <w:p>
       <w:r>
-        <w:t>Momentum = moyenne des rangs de deux performances de prix (6 et 12 mois, avec un décalage standard du dernier mois) et du ratio (révisions en hausse − en baisse) / (hausse + baisse + stables). Tech utilise le prix courant dans les deux performances.</w:t>
+        <w:t>Momentum est la moyenne des rangs de deux variations de prix (6 et 12 mois) et d'un ratio de révisions : (hausses − baisses) / (hausses + baisses + stables). Les prix excluent normalement le mois en cours ; Tech l'inclut.</w:t>
       </w:r>
     </w:p>
     <w:p>
       <w:r>
-        <w:t>Volatility = moyenne de deux sous-scores historiques : volatilité totale, écart-type échantillon annualisé sur 7 rendements, et volatilité baissière, écart-type des seuls rendements négatifs sur une fenêtre de 19 rendements (× √12).</w:t>
+        <w:t>Volatility est la moyenne de deux scores historiques : la volatilité totale sur 7 rendements et la volatilité des rendements négatifs sur 19 mois. Les écarts-types sont annualisés avec √12.</w:t>
       </w:r>
     </w:p>
     <w:p>
@@ -5295,12 +5295,12 @@
     </w:p>
     <w:p>
       <w:r>
-        <w:t>EU : le score U combine quatre composantes, dont la première est décalée d’un mois ; le cycle retenu est AB. US : le score Q combine quatre indicateurs à 30 % / 30 % / 30 % / 10 %, et le cycle retenu est U. Les régimes sont C, R, E ou SD, selon les formules enregistrées dans le fichier macro.</w:t>
+        <w:t>En EU, le score U combine quatre indicateurs ; le premier est décalé d'un mois. Le cycle est en AB. En US, le score Q combine quatre indicateurs avec les poids 30/30/30/10 et le cycle est en U. Les cycles sont C, R, E ou SD.</w:t>
       </w:r>
     </w:p>
     <w:p>
       <w:r>
-        <w:t>Le taux US 10 ans est lissé par EWMA de coefficient 0,715. L’écart au lissage est évalué en percentile historique ; le signal est On au-dessus de 85 % et intervient dans les votes Leverage et Value.</w:t>
+        <w:t>Le signal passe à On si l'écart entre le taux US à 10 ans et sa moyenne mobile exponentielle (0,715) dépasse le 85ᵉ percentile de son historique. Il ajoute alors des votes pour Leverage et Value.</w:t>
       </w:r>
     </w:p>
     <w:p>
@@ -5323,22 +5323,22 @@
         <w:keepNext/>
       </w:pPr>
       <w:r>
-        <w:t>C1. Agrégation des rangs et décisions</w:t>
+        <w:t>C1. Classement et décisions</w:t>
       </w:r>
     </w:p>
     <w:p>
       <w:r>
-        <w:t>Les piliers sont classés entre secteurs. Le score de base additionne les rangs pondérés par les poids standards ; le score de tilt utilise les poids du régime. Le rang du tilt devient la composante macro du score global.</w:t>
+        <w:t>Le programme classe les secteurs pour chaque pilier. Le score de base utilise les poids habituels. Le score de tilt utilise les poids du cycle. Le rang du tilt devient le rang Macro du score global.</w:t>
       </w:r>
     </w:p>
     <w:p>
       <w:r>
-        <w:t>Le score global EU combine six rangs de piliers et le rang macro avec un poids de 1/7 chacun. En US, il combine cinq piliers (Leverage, Value, Momentum, Growth, Volatility) et le rang macro à 1/6 chacun. Margin a un poids nul en US.</w:t>
+        <w:t>En EU, le score global utilise six rangs de piliers et le rang Macro, chacun avec un poids de 1/7. En US, il utilise cinq piliers et Macro, chacun avec un poids de 1/6. Margin a un poids nul en US.</w:t>
       </w:r>
     </w:p>
     <w:p>
       <w:r>
-        <w:t>Lors du calcul des sommes pondérées, un pilier à poids nul n’intervient pas dans le score ni dans son contrôle de disponibilité. Un pilier de poids non nul doit être présent : une donnée importante manquante produit alors un score agrégé absent.</w:t>
+        <w:t>Un pilier de poids zéro n'empêche pas le calcul s'il manque. Si un pilier dont le poids est non nul manque, le score global est indisponible.</w:t>
       </w:r>
     </w:p>
     <w:tbl>
@@ -5824,7 +5824,7 @@
     </w:p>
     <w:p>
       <w:r>
-        <w:t>Les candidats Positive sont triés par votes Top décroissants, puis rang global, puis votes Worst. Les candidats Negative suivent les votes Worst décroissants, puis le rang global croissant. Positive prévaut si les sélections se recoupent.</w:t>
+        <w:t>Le nombre de votes sert d'abord à choisir les secteurs. Le rang global et les autres votes départagent les égalités. Si un secteur est choisi à la fois Positive et Negative, Positive est prioritaire.</w:t>
       </w:r>
     </w:p>
     <w:p>
@@ -5833,7 +5833,7 @@
         <w:keepNext/>
       </w:pPr>
       <w:r>
-        <w:t>C2. Benchmark et performances</w:t>
+        <w:t>C2. Indice de référence et performances</w:t>
       </w:r>
     </w:p>
     <w:tbl>
@@ -6091,17 +6091,17 @@
     </w:p>
     <w:p>
       <w:r>
-        <w:t>La série benchmark utilisée pour les rendements provient de Returns_EQ : rendement(t) = indice(t) / indice(t−1) − 1. Les noms de graphiques suivent désormais la série lue. Le nom SP500_bench du tableau de poids est distinct de la série de rendements WIUSAU Index ; toute modification de benchmark doit être décidée sur la source, pas uniquement sur le titre.</w:t>
+        <w:t>Le rendement de l'indice de référence vient de Returns_EQ : rendement(t) = indice(t) / indice(t−1) − 1. En US, WIUSAU Index est la série de rendement ; SP500_bench est le nom des poids dans Bench. Changer seulement le titre d'un graphique ne change pas les données utilisées.</w:t>
       </w:r>
     </w:p>
     <w:p>
       <w:r>
-        <w:t>Le portefeuille du mois t applique le signal de t−1 aux derniers poids Bench disponibles. Positive : max(1,20 × poids ; poids + 0,05). Negative : min(0,80 × poids ; max(poids − 0,05 ; 0)). Neutral : poids inchangé. Les poids ajustés sont normalisés avant le calcul du rendement.</w:t>
+        <w:t>Le portefeuille d'un mois utilise le signal du mois précédent et les derniers poids Bench. Positive : max(1,20 × poids ; poids + 0,05). Negative : min(0,80 × poids ; max(poids − 0,05 ; 0)). Neutral : poids inchangé. Les poids sont ensuite ramenés à 100 %.</w:t>
       </w:r>
     </w:p>
     <w:p>
       <w:r>
-        <w:t>Les séries de performance incluent benchmark, portefeuille, groupes Top et Bottom et Long/Short = Top − Bottom. actualisation.txt distingue les rendements du benchmark et ceux du portefeuille. En cas de rupture du cumul du portefeuille, il indique le premier mois concerné et les secteurs sans poids Bench ou rendement.</w:t>
+        <w:t>Les graphiques montrent l'indice de référence, le portefeuille, Top, Bottom et Long/Short = Top − Bottom. Si le cumul du portefeuille s'arrête, actualisation.txt indique le premier mois concerné et les secteurs sans poids Bench ou rendement.</w:t>
       </w:r>
     </w:p>
     <w:p>
@@ -6115,7 +6115,7 @@
     </w:p>
     <w:p>
       <w:r>
-        <w:t>Paramètres du modèle : local_config.py. Lecture des entrées et historique : data_utils.py. Scores, seuils et votes : model_secto.py. Portefeuille et tableaux : excel_output.py. Les signaux ICB sont mis à jour par sector_deviations.py ; leur répartition reste dans le classeur d'allocation.</w:t>
+        <w:t>local_config.py contient les paramètres. data_utils.py lit les données et l'historique. model_secto.py calcule les scores et les votes. excel_output.py crée les tableaux. sector_deviations.py met à jour les signaux ICB dans le classeur d'allocation.</w:t>
       </w:r>
     </w:p>
     <w:p>
@@ -6137,22 +6137,22 @@
     </w:p>
     <w:p>
       <w:r>
-        <w:t>Sur Windows avec Excel et Python 3.11, installer les dépendances depuis le dossier du projet : python -m pip install -r requirements.txt. Le programme ne filtre pas le mois en cours ; vérifier qu'il est terminé avant de lancer la production.</w:t>
+        <w:t>Sur l'autre ordinateur, installer Python 3.11 et Excel. Copier le projet dans le dossier de son choix, puis lancer python -m pip install -r requirements.txt depuis ce dossier. Pour actualiser FactSet ou Bloomberg, installer aussi les compléments et disposer d'un accès.</w:t>
       </w:r>
     </w:p>
     <w:p>
       <w:r>
-        <w:t>En fin de actualiser_excel.py, choisir mode et les paramètres de main(...), puis lancer python actualiser_excel.py. production est le mode par défaut : il actualise les classeurs et les ouvre après réussite.</w:t>
+        <w:t>À la fin de actualiser_excel.py, choisir mode et les paramètres de main(...), puis lancer python actualiser_excel.py. Le mode par défaut est production : il met à jour les fichiers et les ouvre après réussite. Vérifier que le mois est terminé : le programme ne filtre pas le mois en cours.</w:t>
       </w:r>
     </w:p>
     <w:p>
       <w:r>
-        <w:t>rebuild et replay exigent un output_dir vide, distinct du projet et de output/. rebuild crée un nouvel historique depuis les Excel et demande history_file=None. replay lit le snapshot choisi par history_file (None = data_history.xlsx du projet), sans ouvrir les Excel source. Ces deux modes ne modifient pas les XLSM.</w:t>
+        <w:t>rebuild et replay demandent un dossier output_dir vide, différent du dossier du projet et de output/. rebuild crée un nouvel historique à partir des Excel et demande history_file=None. replay lit le fichier d'historique indiqué par history_file ; avec None, il utilise data_history.xlsx du projet. Ces modes ne modifient pas les modèles.</w:t>
       </w:r>
     </w:p>
     <w:p>
       <w:r>
-        <w:t>Exemples : choisir mode = "rebuild" et output_dir="output/rebuild_octobre" ; ou mode = "replay", output_dir="output/replay_test" et history_file="output/rebuild_octobre/data_history.xlsx". output_dir et history_file se règlent dans main(...).</w:t>
+        <w:t>Exemple rebuild : mode = "rebuild" et output_dir="output/rebuild_octobre". Exemple replay : mode = "replay", output_dir="output/replay_test" et history_file="output/rebuild_octobre/data_history.xlsx". output_dir et history_file se règlent dans main(...).</w:t>
       </w:r>
     </w:p>
     <w:p>
@@ -6160,22 +6160,22 @@
         <w:pStyle w:val="Heading2"/>
       </w:pPr>
       <w:r>
-        <w:t>D2. Déviations sur les 19 supersecteurs</w:t>
+        <w:t>D2. Répartition vers les 19 supersecteurs</w:t>
       </w:r>
     </w:p>
     <w:p>
       <w:r>
-        <w:t>La production écrit les recommandations dans Signals_EU et Signals_US du classeur existant reco_secto_facto.xlsx. Excel calcule les feuilles secto_eu et secto_us ; les formules et la présentation sont conservées. La date affichée est le premier jour du mois suivant le signal. Le chemin se règle avec SECTOR_DEVIATION_EXCEL_FILE dans local_config.py.</w:t>
+        <w:t>La production écrit les recommandations dans Signals_EU et Signals_US de reco_secto_facto.xlsx. Les formules Excel calculent les feuilles secto_eu et secto_us. La présentation reste en place. La date affichée est le premier jour du mois suivant le signal. Le chemin du fichier se règle dans local_config.py avec SECTOR_DEVIATION_EXCEL_FILE.</w:t>
       </w:r>
     </w:p>
     <w:p>
       <w:r>
-        <w:t>Mapping!I2 fixe l'amplitude (5 % actuellement). Les parts sont en colonnes C/E ; modifier seulement les noms en B/D ne change pas les références aux signaux dans les formules. En EU : Fin se répartit 60/20/20 entre Banks, Financial Services et Insurance ; Materials 50/50 entre Basic Resources et Chemicals ; Indus 80/20 entre Industrial Goods &amp; Services et Construction &amp; Materials. En US, Fin et Materials sont chacun divisés en trois parts égales.</w:t>
+        <w:t>Dans Mapping!I2, on règle l'amplitude : elle est actuellement de 5 %. Les parts sont en C/E. Modifier seulement les noms en B/D ne change pas les références des formules. En EU, Fin est réparti 60/20/20 entre Banks, Financial Services et Insurance ; Materials 50/50 entre Basic Resources et Chemicals ; Indus 80/20 entre Industrial Goods &amp; Services et Construction &amp; Materials. En US, Fin et Materials sont chacun divisés en trois parts égales.</w:t>
       </w:r>
     </w:p>
     <w:p>
       <w:r>
-        <w:t>Les positions positives et négatives sont équilibrées pour obtenir un total nul par marché et par mois. S'il n'existe qu'un seul côté, les déviations sont nulles.</w:t>
+        <w:t>Les positions positives et négatives sont équilibrées pour que le total de chaque marché soit nul chaque mois. S'il n'y a qu'un seul côté, toutes les déviations sont nulles.</w:t>
       </w:r>
     </w:p>
     <w:p>
@@ -6188,12 +6188,12 @@
     </w:p>
     <w:p>
       <w:r>
-        <w:t>Le dossier research/ contient research_secto.ipynb et les notebooks d'audit EU/US. En Python, importer SectorResearch avec : from research.research_secto import SectorResearch. Choisir les variables avant le calcul ; les backtests de recherche sont distincts du portefeuille de production.</w:t>
+        <w:t>Le dossier research/ contient le notebook research_secto.ipynb et les notebooks d'audit EU/US. Dans VS Code, l'extension Jupyter permet de les ouvrir. Pour utiliser la classe en Python : from research.research_secto import SectorResearch. Choisir les variables avant le calcul. Les backtests sont des tests sur les données passées, séparés du portefeuille de production.</w:t>
       </w:r>
     </w:p>
     <w:p>
       <w:r>
-        <w:t>output/ contient les résultats courants et la sauvegarde avant actualisation. archive/ conserve les anciens essais et documents. Ces deux dossiers sont exclus de Git et restent locaux : les copier séparément si leurs fichiers sont nécessaires sur un autre ordinateur.</w:t>
+        <w:t>output/ contient les résultats du mois et la sauvegarde avant actualisation. archive/ contient les anciens essais et documents. Ces dossiers restent sur l'ordinateur et ne sont pas envoyés sur GitHub. Les copier séparément si on en a besoin sur un autre ordinateur.</w:t>
       </w:r>
     </w:p>
     <w:sectPr>
@@ -30175,10 +30175,10 @@
         <a:latin typeface="Calibri"/>
         <a:ea typeface=""/>
         <a:cs typeface=""/>
-        <a:font script="Jpan" typeface="ＭＳ ゴシック"/>
+        <a:font script="Jpan" typeface="Yu Gothic"/>
         <a:font script="Hang" typeface="맑은 고딕"/>
-        <a:font script="Hans" typeface="宋体"/>
-        <a:font script="Hant" typeface="新細明體"/>
+        <a:font script="Hans" typeface="DengXian"/>
+        <a:font script="Hant" typeface="PMingLiU"/>
         <a:font script="Arab" typeface="Times New Roman"/>
         <a:font script="Hebr" typeface="Times New Roman"/>
         <a:font script="Thai" typeface="Angsana New"/>
@@ -30210,10 +30210,10 @@
         <a:latin typeface="Cambria"/>
         <a:ea typeface=""/>
         <a:cs typeface=""/>
-        <a:font script="Jpan" typeface="ＭＳ 明朝"/>
+        <a:font script="Jpan" typeface="Yu Gothic"/>
         <a:font script="Hang" typeface="맑은 고딕"/>
-        <a:font script="Hans" typeface="宋体"/>
-        <a:font script="Hant" typeface="新細明體"/>
+        <a:font script="Hans" typeface="DengXian"/>
+        <a:font script="Hant" typeface="PMingLiU"/>
         <a:font script="Arab" typeface="Arial"/>
         <a:font script="Hebr" typeface="Arial"/>
         <a:font script="Thai" typeface="Cordia New"/>

</xml_diff>